<commit_message>
Rename vin_rst to vin_rst_b, add CW/CCW gray code diagram
- Updated all documentation references from vin_rst to vin_rst_b
- Added matplotlib CW/CCW state transition diagram in section 3.4
- CW (blue) = UP (+1 code), CCW (red) = DOWN (-1 code)
- Updated port description to clarify active-low convention
- Netlist verified correct with new signal name
</commit_message>
<xml_diff>
--- a/doc/HYP_Gen1_CDR_DAC_Spec.docx
+++ b/doc/HYP_Gen1_CDR_DAC_Spec.docx
@@ -54,7 +54,7 @@
           <w:color w:val="505050"/>
           <w:sz w:val="28"/>
         </w:rPr>
-        <w:t>7-Bit Fully Thermometric Differential Current-Steering DAC</w:t>
+        <w:t>9-Bit Fully Thermometric Differential Current-Steering DAC</w:t>
       </w:r>
     </w:p>
     <w:p/>
@@ -161,7 +161,7 @@
                 <w:b w:val="0"/>
                 <w:sz w:val="22"/>
               </w:rPr>
-              <w:t>2026-07-08</w:t>
+              <w:t>2026-07-12</w:t>
             </w:r>
           </w:p>
         </w:tc>
@@ -350,7 +350,7 @@
                 <w:b w:val="0"/>
                 <w:sz w:val="20"/>
               </w:rPr>
-              <w:t>2026-07-08</w:t>
+              <w:t>2025-07-01</w:t>
             </w:r>
           </w:p>
         </w:tc>
@@ -381,6 +381,68 @@
                 <w:sz w:val="20"/>
               </w:rPr>
               <w:t>Initial draft – skeleton/template</w:t>
+            </w:r>
+          </w:p>
+        </w:tc>
+      </w:tr>
+      <w:tr>
+        <w:tc>
+          <w:tcPr>
+            <w:tcW w:type="dxa" w:w="2268"/>
+          </w:tcPr>
+          <w:p>
+            <w:r/>
+            <w:r>
+              <w:rPr>
+                <w:b w:val="0"/>
+                <w:sz w:val="20"/>
+              </w:rPr>
+              <w:t>0.2</w:t>
+            </w:r>
+          </w:p>
+        </w:tc>
+        <w:tc>
+          <w:tcPr>
+            <w:tcW w:type="dxa" w:w="2268"/>
+          </w:tcPr>
+          <w:p>
+            <w:r/>
+            <w:r>
+              <w:rPr>
+                <w:b w:val="0"/>
+                <w:sz w:val="20"/>
+              </w:rPr>
+              <w:t>2026-07-12</w:t>
+            </w:r>
+          </w:p>
+        </w:tc>
+        <w:tc>
+          <w:tcPr>
+            <w:tcW w:type="dxa" w:w="2268"/>
+          </w:tcPr>
+          <w:p>
+            <w:r/>
+            <w:r>
+              <w:rPr>
+                <w:b w:val="0"/>
+                <w:sz w:val="20"/>
+              </w:rPr>
+              <w:t>[Author]</w:t>
+            </w:r>
+          </w:p>
+        </w:tc>
+        <w:tc>
+          <w:tcPr>
+            <w:tcW w:type="dxa" w:w="2268"/>
+          </w:tcPr>
+          <w:p>
+            <w:r/>
+            <w:r>
+              <w:rPr>
+                <w:b w:val="0"/>
+                <w:sz w:val="20"/>
+              </w:rPr>
+              <w:t>Updated to 9-bit (511 codes); added INL/DNL formulas (sec 4.2)</w:t>
             </w:r>
           </w:p>
         </w:tc>
@@ -1083,9 +1145,9 @@
     </w:p>
     <w:p>
       <w:r>
-        <w:t>Topology: 7-bit fully thermometric, differential current-steering DAC.</w:t>
+        <w:t>Topology: 9-bit fully thermometric, differential current-steering DAC.</w:t>
         <w:br/>
-        <w:t>Number of unit elements: N = 2^7 - 1 = 127 unit current sources.</w:t>
+        <w:t>Number of unit elements: N = 2^9 - 1 = 511 unit current sources.</w:t>
       </w:r>
     </w:p>
     <w:p>
@@ -1348,7 +1410,7 @@
                 <w:b w:val="0"/>
                 <w:sz w:val="20"/>
               </w:rPr>
-              <w:t>7</w:t>
+              <w:t>9</w:t>
             </w:r>
           </w:p>
         </w:tc>
@@ -1455,7 +1517,7 @@
                 <w:b w:val="0"/>
                 <w:sz w:val="20"/>
               </w:rPr>
-              <w:t>127</w:t>
+              <w:t>511</w:t>
             </w:r>
           </w:p>
         </w:tc>
@@ -1561,6 +1623,7 @@
                 <w:b w:val="0"/>
                 <w:sz w:val="20"/>
               </w:rPr>
+              <w:t>10.02</w:t>
             </w:r>
           </w:p>
         </w:tc>
@@ -1589,7 +1652,7 @@
                 <w:b w:val="0"/>
                 <w:sz w:val="20"/>
               </w:rPr>
-              <w:t>µA</w:t>
+              <w:t>mA</w:t>
             </w:r>
           </w:p>
         </w:tc>
@@ -1604,6 +1667,7 @@
                 <w:b w:val="0"/>
                 <w:sz w:val="20"/>
               </w:rPr>
+              <w:t>511 × 19.6 µA</w:t>
             </w:r>
           </w:p>
         </w:tc>
@@ -1664,6 +1728,7 @@
                 <w:b w:val="0"/>
                 <w:sz w:val="20"/>
               </w:rPr>
+              <w:t>19.6</w:t>
             </w:r>
           </w:p>
         </w:tc>
@@ -1707,7 +1772,7 @@
                 <w:b w:val="0"/>
                 <w:sz w:val="20"/>
               </w:rPr>
-              <w:t>I_FS / 127</w:t>
+              <w:t>I_FS / 511</w:t>
             </w:r>
           </w:p>
         </w:tc>
@@ -2858,7 +2923,150 @@
         <w:pStyle w:val="Heading2"/>
       </w:pPr>
       <w:r>
-        <w:t>4.2 Matching Requirements</w:t>
+        <w:t>4.2 INL and DNL Definitions</w:t>
+      </w:r>
+    </w:p>
+    <w:p>
+      <w:r>
+        <w:t>For a fully thermometric differential current-steering DAC with N = 2^B - 1 unit current sources (B = 9, N = 511):</w:t>
+      </w:r>
+    </w:p>
+    <w:p>
+      <w:pPr>
+        <w:pStyle w:val="Heading3"/>
+      </w:pPr>
+      <w:r>
+        <w:t>4.2.1 DNL (Differential Non-Linearity)</w:t>
+      </w:r>
+    </w:p>
+    <w:p>
+      <w:r>
+        <w:t>DNL measures the deviation of each code step from the ideal 1-LSB step size.</w:t>
+        <w:br/>
+        <w:br/>
+        <w:t>Definition (endpoint-fitted):</w:t>
+        <w:br/>
+        <w:br/>
+        <w:t xml:space="preserve">    DNL(k) = [V_out(k+1) - V_out(k)] / LSB_actual  -  1</w:t>
+        <w:br/>
+        <w:br/>
+        <w:t>where:</w:t>
+        <w:br/>
+        <w:t xml:space="preserve">    LSB_actual = [V_out(N) - V_out(0)] / N</w:t>
+        <w:br/>
+        <w:br/>
+        <w:t>For a fully thermometric DAC, each code transition activates exactly one unit current source. Therefore:</w:t>
+        <w:br/>
+        <w:br/>
+        <w:t xml:space="preserve">    DNL(k) = [I_unit(k) - I_avg] / I_avg</w:t>
+        <w:br/>
+        <w:br/>
+        <w:t>where I_unit(k) is the current of the k-th unit source and I_avg is the mean of all N unit sources.</w:t>
+        <w:br/>
+        <w:br/>
+        <w:t>Specification: |DNL| &lt; 0.5 LSB (guarantees monotonicity)</w:t>
+      </w:r>
+    </w:p>
+    <w:p>
+      <w:pPr>
+        <w:pStyle w:val="Heading3"/>
+      </w:pPr>
+      <w:r>
+        <w:t>4.2.2 INL (Integral Non-Linearity)</w:t>
+      </w:r>
+    </w:p>
+    <w:p>
+      <w:r>
+        <w:t>INL measures the cumulative deviation of the transfer function from the ideal straight line.</w:t>
+        <w:br/>
+        <w:br/>
+        <w:t>Definition (endpoint-fitted):</w:t>
+        <w:br/>
+        <w:br/>
+        <w:t xml:space="preserve">    INL(k) = [V_out(k) - V_out(0)] / LSB_actual  -  k</w:t>
+        <w:br/>
+        <w:br/>
+        <w:t>Equivalently, INL is the cumulative sum of DNL:</w:t>
+        <w:br/>
+        <w:br/>
+        <w:t xml:space="preserve">    INL(k) = Σ_{i=0}^{k-1} DNL(i)</w:t>
+        <w:br/>
+        <w:br/>
+        <w:t>For a differential DAC with output V_diff = I_diff × R_L:</w:t>
+        <w:br/>
+        <w:br/>
+        <w:t xml:space="preserve">    INL(k) = [V_diff(k) - V_diff(0)] / LSB_actual  -  k</w:t>
+        <w:br/>
+        <w:t xml:space="preserve">    LSB_actual = [V_diff(N) - V_diff(0)] / N</w:t>
+      </w:r>
+    </w:p>
+    <w:p>
+      <w:pPr>
+        <w:pStyle w:val="Heading3"/>
+      </w:pPr>
+      <w:r>
+        <w:t>4.2.3 Differential DAC: Finite Rout Effect</w:t>
+      </w:r>
+    </w:p>
+    <w:p>
+      <w:r>
+        <w:t>For a differential current-steering DAC, the first-order finite-Rout effect cancels between the two output branches, producing only a gain error (no INL):</w:t>
+        <w:br/>
+        <w:br/>
+        <w:t xml:space="preserve">    Gain Error = (N × R_L) / (2 × R_out)</w:t>
+        <w:br/>
+        <w:br/>
+        <w:t>Second-order INL from Rout variation across code:</w:t>
+        <w:br/>
+        <w:br/>
+        <w:t xml:space="preserve">    INL_diff_max ≈ (N² / 42) × Δg_ds × R_L   [LSBs]</w:t>
+        <w:br/>
+        <w:br/>
+        <w:t>where Δg_ds is the variation of output conductance across the output voltage swing.</w:t>
+      </w:r>
+    </w:p>
+    <w:p>
+      <w:pPr>
+        <w:pStyle w:val="Heading3"/>
+      </w:pPr>
+      <w:r>
+        <w:t>4.2.4 Mismatch-Limited DNL (Statistical)</w:t>
+      </w:r>
+    </w:p>
+    <w:p>
+      <w:r>
+        <w:t>Given relative mismatch σ_rel = σ(I_unit)/I_unit, the probability that ALL N codes meet |DNL| &lt; DNL_target:</w:t>
+        <w:br/>
+        <w:br/>
+        <w:t xml:space="preserve">    Yield = [2·Φ(DNL_target / σ_rel) - 1]^N</w:t>
+        <w:br/>
+        <w:br/>
+        <w:t>where Φ is the standard normal CDF.</w:t>
+        <w:br/>
+        <w:br/>
+        <w:t>Solving for required σ_rel at a given yield target Y:</w:t>
+        <w:br/>
+        <w:br/>
+        <w:t xml:space="preserve">    σ_rel = DNL_target / Φ⁻¹[(1 + Y^(1/N)) / 2]</w:t>
+        <w:br/>
+        <w:br/>
+        <w:t>For N = 511, |DNL| &lt; 0.5 LSB:</w:t>
+        <w:br/>
+        <w:t xml:space="preserve">  • 90% yield → σ_rel ≤ TBD %</w:t>
+        <w:br/>
+        <w:t xml:space="preserve">  • 95% yield → σ_rel ≤ TBD %</w:t>
+        <w:br/>
+        <w:t xml:space="preserve">  • 99% yield → σ_rel ≤ TBD %</w:t>
+        <w:br/>
+        <w:t xml:space="preserve">  • 3σ (99.7%) yield → σ_rel ≤ TBD %</w:t>
+      </w:r>
+    </w:p>
+    <w:p>
+      <w:pPr>
+        <w:pStyle w:val="Heading2"/>
+      </w:pPr>
+      <w:r>
+        <w:t>4.3 Matching Requirements</w:t>
       </w:r>
     </w:p>
     <w:p>
@@ -2866,7 +3074,7 @@
         <w:t>Based on Monte Carlo analysis (see dac_sigma_vs_dnl.py):</w:t>
         <w:br/>
         <w:br/>
-        <w:t>For |DNL| &lt; 0.5 LSB with 127 unit elements:</w:t>
+        <w:t>For |DNL| &lt; 0.5 LSB with 511 unit elements:</w:t>
         <w:br/>
         <w:t xml:space="preserve">  • 90% yield → σ_rel ≤ TBD %</w:t>
         <w:br/>
@@ -2929,6 +3137,9 @@
         <w:t>[Define interface: async pulse (UP/DN), synchronous parallel, or hybrid.</w:t>
         <w:br/>
         <w:t>Reference system_questions.md Q1–Q9 for open decisions.]</w:t>
+        <w:br/>
+        <w:br/>
+        <w:t>CODE[8:0]: 9-bit thermometer state (511 codes)</w:t>
       </w:r>
     </w:p>
     <w:p>
@@ -3216,7 +3427,7 @@
                 <w:b w:val="0"/>
                 <w:sz w:val="20"/>
               </w:rPr>
-              <w:t>CODE[6:0]</w:t>
+              <w:t>CODE[8:0]</w:t>
             </w:r>
           </w:p>
         </w:tc>
@@ -3246,7 +3457,7 @@
                 <w:b w:val="0"/>
                 <w:sz w:val="20"/>
               </w:rPr>
-              <w:t>7</w:t>
+              <w:t>9</w:t>
             </w:r>
           </w:p>
         </w:tc>
@@ -4142,7 +4353,7 @@
                 <w:b w:val="0"/>
                 <w:sz w:val="20"/>
               </w:rPr>
-              <w:t>Force code 127, measure I_out</w:t>
+              <w:t>Force code 511, measure I_out</w:t>
             </w:r>
           </w:p>
         </w:tc>
@@ -4264,7 +4475,7 @@
                 <w:b w:val="0"/>
                 <w:sz w:val="20"/>
               </w:rPr>
-              <w:t>Verify no code reversal</w:t>
+              <w:t>Verify no code reversal (DNL &gt; -1)</w:t>
             </w:r>
           </w:p>
         </w:tc>

</xml_diff>